<commit_message>
Replace "धारा" with "Section" across CRM (Hindi text unchanged)
Renames the section keyword everywhere it appears while leaving all
surrounding Hindi copy as-is:

- public/agreement.html  81 occurrences (agreement + परिशिष्ट "अ" + PDC slip)
- public/index.html       1 occurrence  (video audio-summary bullet)
- server.js               1 occurrence  (Q5 of the video script)
- 4 .docx templates      70 occurrences (word/document.xml only)

Includes statute references, so "धारा 138" -> "Section 138" and
"धारा 74" -> "Section 74".

Replacement was word-boundary guarded so words merely containing धार
are untouched: आधार, आधारित, आधारों, उधार, खाताधारक, निर्धारित,
पुनर्निर्धारित. Counts verified identical before/after.

Also fixes a pre-existing SyntaxError in server.js (Q9 used literal
newlines inside single-quoted strings), which prevented the server from
starting at all. Converted to a template literal, matching Q10. Rendered
text is byte-identical to what was intended.
</commit_message>
<xml_diff>
--- a/Kiro Agrmeent.docx
+++ b/Kiro Agrmeent.docx
@@ -718,7 +718,7 @@
         <w:t xml:space="preserve">प्रारंभिक परामर्श / मुलाकात शुल्क (निश्चित):</w:t>
       </w:r>
       <w:r>
-        <w:t xml:space="preserve"> ग्राहक के साथ प्रथम मुलाकात/परामर्श बैठक के समय Ruralift एक निश्चित प्रारंभिक परामर्श शुल्क रु. 500/- (रुपये पाँच सौ मात्र) लेगा। यह शुल्क सभी ग्राहकों पर समान रूप से लागू होता है और पूर्णतः Ruralift द्वारा बैठक में दिए गए समय, विशेषज्ञ परामर्श, ऋण पात्रता आकलन एवं मार्गदर्शन के प्रतिफल (consideration) में है — ठीक उसी प्रकार जैसे चिकित्सक, अधिवक्ता एवं अन्य पेशेवर अपने परामर्श-समय हेतु निर्धारित शुल्क लेते हैं। यह शुल्क प्रथम मुलाकात के समय देय है और चूँकि यह केवल समय एवं परामर्श का मूल्य है, ऋण स्वीकृत हो अथवा न हो, यह अप्रतिदेय (non-refundable) रहेगा। यह प्रारंभिक परामर्श शुल्क धारा 2 में वर्णित सफलता-आधारित परामर्श शुल्क एवं किसी भी DSA/कमीशन से पूर्णतः पृथक एवं स्वतंत्र है।</w:t>
+        <w:t xml:space="preserve"> ग्राहक के साथ प्रथम मुलाकात/परामर्श बैठक के समय Ruralift एक निश्चित प्रारंभिक परामर्श शुल्क रु. 500/- (रुपये पाँच सौ मात्र) लेगा। यह शुल्क सभी ग्राहकों पर समान रूप से लागू होता है और पूर्णतः Ruralift द्वारा बैठक में दिए गए समय, विशेषज्ञ परामर्श, ऋण पात्रता आकलन एवं मार्गदर्शन के प्रतिफल (consideration) में है — ठीक उसी प्रकार जैसे चिकित्सक, अधिवक्ता एवं अन्य पेशेवर अपने परामर्श-समय हेतु निर्धारित शुल्क लेते हैं। यह शुल्क प्रथम मुलाकात के समय देय है और चूँकि यह केवल समय एवं परामर्श का मूल्य है, ऋण स्वीकृत हो अथवा न हो, यह अप्रतिदेय (non-refundable) रहेगा। यह प्रारंभिक परामर्श शुल्क Section 2 में वर्णित सफलता-आधारित परामर्श शुल्क एवं किसी भी DSA/कमीशन से पूर्णतः पृथक एवं स्वतंत्र है।</w:t>
       </w:r>
     </w:p>
     <w:p>
@@ -737,7 +737,7 @@
         <w:t xml:space="preserve">सफलता-आधारित परामर्श शुल्क:</w:t>
       </w:r>
       <w:r>
-        <w:t xml:space="preserve"> उपरोक्त निश्चित प्रारंभिक परामर्श शुल्क (धारा 2.1) के अतिरिक्त, सहमत सफलता-आधारित परामर्श शुल्क केवल ग्राहक के बैंक खाते में ऋण राशि के सफल वितरण के बाद ही देय होगा। धारा 2.1 के प्रारंभिक परामर्श शुल्क को छोड़कर, ऋण वितरण से पूर्व किसी भी चरण में कोई अन्य शुल्क या प्रसंस्करण शुल्क नहीं लिया जाएगा।</w:t>
+        <w:t xml:space="preserve"> उपरोक्त निश्चित प्रारंभिक परामर्श शुल्क (Section 2.1) के अतिरिक्त, सहमत सफलता-आधारित परामर्श शुल्क केवल ग्राहक के बैंक खाते में ऋण राशि के सफल वितरण के बाद ही देय होगा। Section 2.1 के प्रारंभिक परामर्श शुल्क को छोड़कर, ऋण वितरण से पूर्व किसी भी चरण में कोई अन्य शुल्क या प्रसंस्करण शुल्क नहीं लिया जाएगा।</w:t>
       </w:r>
     </w:p>
     <w:p>
@@ -942,7 +942,7 @@
         <w:t xml:space="preserve">ऋण के सफल वितरण पर:</w:t>
       </w:r>
       <w:r>
-        <w:t xml:space="preserve"> PDC को अनुबंध की धारा 2 में दर्ज सहमत परामर्श शुल्क के रूप में प्रस्तुत किया जाएगा।</w:t>
+        <w:t xml:space="preserve"> PDC को अनुबंध की Section 2 में दर्ज सहमत परामर्श शुल्क के रूप में प्रस्तुत किया जाएगा।</w:t>
       </w:r>
     </w:p>
     <w:p>
@@ -958,10 +958,10 @@
         <w:rPr>
           <w:b/>
         </w:rPr>
-        <w:t xml:space="preserve">ग्राहक द्वारा अनुबंध भंग होने पर (धारा 4 में परिभाषित):</w:t>
-      </w:r>
-      <w:r>
-        <w:t xml:space="preserve"> PDC को क्षतिपूर्ति (Liquidated Damages) के रूप में जमा किया जाएगा। इस स्थिति में चेक अनादरित हो सकता है और ग्राहक परक्राम्य लिखत अधिनियम, 1881 की धारा 138 के अंतर्गत दायी होगा।</w:t>
+        <w:t xml:space="preserve">ग्राहक द्वारा अनुबंध भंग होने पर (Section 4 में परिभाषित):</w:t>
+      </w:r>
+      <w:r>
+        <w:t xml:space="preserve"> PDC को क्षतिपूर्ति (Liquidated Damages) के रूप में जमा किया जाएगा। इस स्थिति में चेक अनादरित हो सकता है और ग्राहक परक्राम्य लिखत अधिनियम, 1881 की Section 138 के अंतर्गत दायी होगा।</w:t>
       </w:r>
     </w:p>
     <w:p>
@@ -1027,7 +1027,7 @@
         <w:t xml:space="preserve">चेक अनादरण के परिणाम:</w:t>
       </w:r>
       <w:r>
-        <w:t xml:space="preserve"> ग्राहक स्वीकार करता है कि PDC का अनादरण (bounce) परक्राम्य लिखत अधिनियम, 1881 की धारा 138 के अंतर्गत आपराधिक अपराध है जिसमें दो वर्ष तक का कारावास और/या चेक राशि के दोगुने तक का जुर्माना हो सकता है। ग्राहक इस कानूनी परिणाम से पूर्णतः अवगत होकर PDC जारी कर रहा है।</w:t>
+        <w:t xml:space="preserve"> ग्राहक स्वीकार करता है कि PDC का अनादरण (bounce) परक्राम्य लिखत अधिनियम, 1881 की Section 138 के अंतर्गत आपराधिक अपराध है जिसमें दो वर्ष तक का कारावास और/या चेक राशि के दोगुने तक का जुर्माना हो सकता है। ग्राहक इस कानूनी परिणाम से पूर्णतः अवगत होकर PDC जारी कर रहा है।</w:t>
       </w:r>
     </w:p>
     <w:p>
@@ -1167,7 +1167,7 @@
         <w:t xml:space="preserve">नुकसान भरपाई (Liquidated Damages):</w:t>
       </w:r>
       <w:r>
-        <w:t xml:space="preserve"> धारा 4.1 के अंतर्गत अनुबंध भंग की स्थिति में, ग्राहक इस अनुबंध में दर्ज </w:t>
+        <w:t xml:space="preserve"> Section 4.1 के अंतर्गत अनुबंध भंग की स्थिति में, ग्राहक इस अनुबंध में दर्ज </w:t>
       </w:r>
       <w:r>
         <w:rPr>
@@ -1185,17 +1185,17 @@
         <w:t xml:space="preserve">अधिक</w:t>
       </w:r>
       <w:r>
-        <w:t xml:space="preserve"> हो। यह राशि समय निवेश, कर्मचारी प्रयास, अवसर लागत (opportunity cost), परिचालन व्यय और व्यावसायिक हानि की एक उचित एवं पूर्व-अनुमानित क्षतिपूर्ति है जिस पर हस्ताक्षर के समय दोनों पक्षों की स्वतंत्र सहमति है। दोनों पक्ष स्वीकार करते हैं कि यह राशि भारतीय अनुबंध अधिनियम, 1872 की धारा 74 के अंतर्गत उचित पूर्व-अनुमान (genuine pre-estimate) है। Ruralift को किसी भी बिल, चालान, रसीद, वास्तविक खर्च का कोई दस्तावेजी प्रमाण या वास्तविक हानि का प्रमाण प्रस्तुत करने की आवश्यकता नहीं होगी।</w:t>
-      </w:r>
-    </w:p>
-    <w:p>
-      <w:r>
-        <w:t/>
-      </w:r>
-    </w:p>
-    <w:p>
-      <w:r>
-        <w:t xml:space="preserve">4.3 अनुबंध भंग की स्थिति में Ruralift PDC जमा करने का अधिकार सुरक्षित रखता है। चेक का अनादरण परक्राम्य लिखत अधिनियम, 1881 की धारा 138 के अंतर्गत आपराधिक कार्यवाही को आकर्षित करेगा।</w:t>
+        <w:t xml:space="preserve"> हो। यह राशि समय निवेश, कर्मचारी प्रयास, अवसर लागत (opportunity cost), परिचालन व्यय और व्यावसायिक हानि की एक उचित एवं पूर्व-अनुमानित क्षतिपूर्ति है जिस पर हस्ताक्षर के समय दोनों पक्षों की स्वतंत्र सहमति है। दोनों पक्ष स्वीकार करते हैं कि यह राशि भारतीय अनुबंध अधिनियम, 1872 की Section 74 के अंतर्गत उचित पूर्व-अनुमान (genuine pre-estimate) है। Ruralift को किसी भी बिल, चालान, रसीद, वास्तविक खर्च का कोई दस्तावेजी प्रमाण या वास्तविक हानि का प्रमाण प्रस्तुत करने की आवश्यकता नहीं होगी।</w:t>
+      </w:r>
+    </w:p>
+    <w:p>
+      <w:r>
+        <w:t/>
+      </w:r>
+    </w:p>
+    <w:p>
+      <w:r>
+        <w:t xml:space="preserve">4.3 अनुबंध भंग की स्थिति में Ruralift PDC जमा करने का अधिकार सुरक्षित रखता है। चेक का अनादरण परक्राम्य लिखत अधिनियम, 1881 की Section 138 के अंतर्गत आपराधिक कार्यवाही को आकर्षित करेगा।</w:t>
       </w:r>
     </w:p>
     <w:p>
@@ -1233,7 +1233,7 @@
         <w:t xml:space="preserve">अतिरिक्त उपचार:</w:t>
       </w:r>
       <w:r>
-        <w:t xml:space="preserve"> धारा 4.2 में उल्लिखित नुकसान भरपाई के अतिरिक्त, Ruralift कानून द्वारा उपलब्ध किसी भी अन्य उपचार (सिविल या आपराधिक) का अधिकारी होगा। नुकसान भरपाई की स्वीकृति Ruralift के अन्य कानूनी अधिकारों का त्याग नहीं मानी जाएगी।</w:t>
+        <w:t xml:space="preserve"> Section 4.2 में उल्लिखित नुकसान भरपाई के अतिरिक्त, Ruralift कानून द्वारा उपलब्ध किसी भी अन्य उपचार (सिविल या आपराधिक) का अधिकारी होगा। नुकसान भरपाई की स्वीकृति Ruralift के अन्य कानूनी अधिकारों का त्याग नहीं मानी जाएगी।</w:t>
       </w:r>
     </w:p>
     <w:p>
@@ -1350,7 +1350,7 @@
     </w:p>
     <w:p>
       <w:r>
-        <w:t xml:space="preserve">5.4 इस धारा के उल्लंघन की स्थिति में, ग्राहक धारा 4.2 में निर्धारित नुकसान भरपाई के अतिरिक्त, Ruralift को उचित क्षतिपूर्ति देने का उत्तरदायी होगा।</w:t>
+        <w:t xml:space="preserve">5.4 इस Section के उल्लंघन की स्थिति में, ग्राहक Section 4.2 में निर्धारित नुकसान भरपाई के अतिरिक्त, Ruralift को उचित क्षतिपूर्ति देने का उत्तरदायी होगा।</w:t>
       </w:r>
     </w:p>
     <w:p>
@@ -1678,17 +1678,17 @@
     </w:p>
     <w:p>
       <w:r>
-        <w:t xml:space="preserve">स. प्रारंभिक परामर्श/मुलाकात शुल्क (धारा 2.1 में वर्णित रु. 500/- निश्चित शुल्क) को छोड़कर, Ruralift किसी भी परिस्थिति में ऋण वितरण से पूर्व कोई अन्य शुल्क नहीं लेगा।</w:t>
-      </w:r>
-    </w:p>
-    <w:p>
-      <w:r>
-        <w:t/>
-      </w:r>
-    </w:p>
-    <w:p>
-      <w:r>
-        <w:t xml:space="preserve">द. ग्राहक की चूक के बिना ऋण अस्वीकृत होने पर Ruralift धारा 3.5 के अनुसार PDC वापस करेगा।</w:t>
+        <w:t xml:space="preserve">स. प्रारंभिक परामर्श/मुलाकात शुल्क (Section 2.1 में वर्णित रु. 500/- निश्चित शुल्क) को छोड़कर, Ruralift किसी भी परिस्थिति में ऋण वितरण से पूर्व कोई अन्य शुल्क नहीं लेगा।</w:t>
+      </w:r>
+    </w:p>
+    <w:p>
+      <w:r>
+        <w:t/>
+      </w:r>
+    </w:p>
+    <w:p>
+      <w:r>
+        <w:t xml:space="preserve">द. ग्राहक की चूक के बिना ऋण अस्वीकृत होने पर Ruralift Section 3.5 के अनुसार PDC वापस करेगा।</w:t>
       </w:r>
     </w:p>
     <w:p>
@@ -1760,7 +1760,7 @@
     </w:p>
     <w:p>
       <w:r>
-        <w:t xml:space="preserve">द. ग्राहक हस्ताक्षर के समय धारा 3 में वर्णित PDC जारी करेगा।</w:t>
+        <w:t xml:space="preserve">द. ग्राहक हस्ताक्षर के समय Section 3 में वर्णित PDC जारी करेगा।</w:t>
       </w:r>
     </w:p>
     <w:p>
@@ -2248,7 +2248,7 @@
         <w:t xml:space="preserve">अधिकार क्षेत्र (Jurisdiction):</w:t>
       </w:r>
       <w:r>
-        <w:t xml:space="preserve"> उपरोक्त मध्यस्थता के अतिरिक्त या मध्यस्थता से बाहर के विषयों (जैसे धारा 138 NI Act कार्यवाही) के लिए, विवाद </w:t>
+        <w:t xml:space="preserve"> उपरोक्त मध्यस्थता के अतिरिक्त या मध्यस्थता से बाहर के विषयों (जैसे Section 138 NI Act कार्यवाही) के लिए, विवाद </w:t>
       </w:r>
       <w:r>
         <w:rPr>
@@ -2327,7 +2327,7 @@
         <w:t xml:space="preserve">पृथक्करणीयता (Severability):</w:t>
       </w:r>
       <w:r>
-        <w:t xml:space="preserve"> यदि इस अनुबंध की कोई धारा या प्रावधान किसी सक्षम न्यायालय या प्राधिकरण द्वारा अमान्य, अवैध या अप्रवर्तनीय घोषित किया जाता है, तो शेष धारा एवं प्रावधान पूर्ण रूप से प्रभावी और बाध्यकारी बने रहेंगे। अमान्य धारा को न्यूनतम आवश्यक सीमा तक संशोधित माना जाएगा।</w:t>
+        <w:t xml:space="preserve"> यदि इस अनुबंध की कोई Section या प्रावधान किसी सक्षम न्यायालय या प्राधिकरण द्वारा अमान्य, अवैध या अप्रवर्तनीय घोषित किया जाता है, तो शेष Section एवं प्रावधान पूर्ण रूप से प्रभावी और बाध्यकारी बने रहेंगे। अमान्य Section को न्यूनतम आवश्यक सीमा तक संशोधित माना जाएगा।</w:t>
       </w:r>
     </w:p>
     <w:p>
@@ -2403,7 +2403,7 @@
         <w:t xml:space="preserve">उत्तरजीविता (Survival):</w:t>
       </w:r>
       <w:r>
-        <w:t xml:space="preserve"> धारा 4 (अनुबंध भंग), धारा 5 (गैर-परिवर्जन), धारा 6 (दायित्व की सीमा), धारा 7 (क्षतिपूर्ति), धारा 8 (गोपनीयता), और धारा 14 (विवाद समाधान) इस अनुबंध की समाप्ति या पूर्णता के बाद भी प्रभावी रहेंगी।</w:t>
+        <w:t xml:space="preserve"> Section 4 (अनुबंध भंग), Section 5 (गैर-परिवर्जन), Section 6 (दायित्व की सीमा), Section 7 (क्षतिपूर्ति), Section 8 (गोपनीयता), और Section 14 (विवाद समाधान) इस अनुबंध की समाप्ति या पूर्णता के बाद भी प्रभावी रहेंगी।</w:t>
       </w:r>
     </w:p>
     <w:p>
@@ -2503,7 +2503,7 @@
     </w:p>
     <w:p>
       <w:r>
-        <w:t xml:space="preserve">स. मैं शुल्क संरचना को समझता/समझती हूँ और स्वीकार करता/करती हूँ कि धारा 2.1 में वर्णित रु. 500/- का प्रारंभिक परामर्श/मुलाकात शुल्क प्रथम मुलाकात के समय देय एवं अप्रतिदेय है, तथा धारा 2 में दर्ज सहमत सफलता-आधारित परामर्श शुल्क ऋण वितरण पर </w:t>
+        <w:t xml:space="preserve">स. मैं शुल्क संरचना को समझता/समझती हूँ और स्वीकार करता/करती हूँ कि Section 2.1 में वर्णित रु. 500/- का प्रारंभिक परामर्श/मुलाकात शुल्क प्रथम मुलाकात के समय देय एवं अप्रतिदेय है, तथा Section 2 में दर्ज सहमत सफलता-आधारित परामर्श शुल्क ऋण वितरण पर </w:t>
       </w:r>
       <w:r>
         <w:rPr>
@@ -2522,7 +2522,7 @@
     </w:p>
     <w:p>
       <w:r>
-        <w:t xml:space="preserve">द. मैं धारा 4 में उल्लिखित अनुबंध भंग के परिणामों को </w:t>
+        <w:t xml:space="preserve">द. मैं Section 4 में उल्लिखित अनुबंध भंग के परिणामों को </w:t>
       </w:r>
       <w:r>
         <w:rPr>
@@ -2541,13 +2541,13 @@
     </w:p>
     <w:p>
       <w:r>
-        <w:t xml:space="preserve">इ. मैंने स्वेच्छा से धारा 3 में वर्णित अग्रदिनांकित चेक जारी किया है और उन परिस्थितियों को समझता/समझती हूँ जिनमें इसे जमा किया जा सकता है, </w:t>
-      </w:r>
-      <w:r>
-        <w:rPr>
-          <w:b/>
-        </w:rPr>
-        <w:t xml:space="preserve">जिसमें चेक अनादरण के आपराधिक परिणाम (धारा 138 NI Act) शामिल हैं।</w:t>
+        <w:t xml:space="preserve">इ. मैंने स्वेच्छा से Section 3 में वर्णित अग्रदिनांकित चेक जारी किया है और उन परिस्थितियों को समझता/समझती हूँ जिनमें इसे जमा किया जा सकता है, </w:t>
+      </w:r>
+      <w:r>
+        <w:rPr>
+          <w:b/>
+        </w:rPr>
+        <w:t xml:space="preserve">जिसमें चेक अनादरण के आपराधिक परिणाम (Section 138 NI Act) शामिल हैं।</w:t>
       </w:r>
       <w:r>
         <w:t xml:space="preserve"/>
@@ -2607,17 +2607,17 @@
         <w:t xml:space="preserve">कोई गारंटी नहीं</w:t>
       </w:r>
       <w:r>
-        <w:t xml:space="preserve"> दी गई है और मैं स्वीकार करता/करती हूँ कि सफलता-आधारित परामर्श शुल्क केवल सफल वितरण पर ही देय है, जबकि धारा 2.1 का प्रारंभिक परामर्श शुल्क इससे पृथक एवं प्रथम मुलाकात पर देय है।</w:t>
-      </w:r>
-    </w:p>
-    <w:p>
-      <w:r>
-        <w:t/>
-      </w:r>
-    </w:p>
-    <w:p>
-      <w:r>
-        <w:t xml:space="preserve">झ. मैं स्वीकार करता/करती हूँ कि Ruralift को मेरी व्यक्तिगत जानकारी और दस्तावेज़ ऋण संस्थानों के साथ साझा करने की मेरी सहमति है (धारा 8)।</w:t>
+        <w:t xml:space="preserve"> दी गई है और मैं स्वीकार करता/करती हूँ कि सफलता-आधारित परामर्श शुल्क केवल सफल वितरण पर ही देय है, जबकि Section 2.1 का प्रारंभिक परामर्श शुल्क इससे पृथक एवं प्रथम मुलाकात पर देय है।</w:t>
+      </w:r>
+    </w:p>
+    <w:p>
+      <w:r>
+        <w:t/>
+      </w:r>
+    </w:p>
+    <w:p>
+      <w:r>
+        <w:t xml:space="preserve">झ. मैं स्वीकार करता/करती हूँ कि Ruralift को मेरी व्यक्तिगत जानकारी और दस्तावेज़ ऋण संस्थानों के साथ साझा करने की मेरी सहमति है (Section 8)।</w:t>
       </w:r>
     </w:p>
     <w:p>
@@ -4201,7 +4201,7 @@
     </w:p>
     <w:p>
       <w:r>
-        <w:t xml:space="preserve">5. चेक अनादरण की स्थिति में ग्राहक परक्राम्य लिखत अधिनियम, 1881 की धारा 138 के अंतर्गत आपराधिक रूप से दायी होगा।</w:t>
+        <w:t xml:space="preserve">5. चेक अनादरण की स्थिति में ग्राहक परक्राम्य लिखत अधिनियम, 1881 की Section 138 के अंतर्गत आपराधिक रूप से दायी होगा।</w:t>
       </w:r>
     </w:p>
     <w:p>

</xml_diff>